<commit_message>
Align V3 report with 2929 completed benchmark pairs
</commit_message>
<xml_diff>
--- a/results/v3/ANALYSIS.docx
+++ b/results/v3/ANALYSIS.docx
@@ -23,7 +23,7 @@
         <w:rPr>
           <w:b w:val="0"/>
         </w:rPr>
-        <w:t>Four logical run records • Development and full benchmark • Recorded 17 October 2026</w:t>
+        <w:t>Development checkpoint and full benchmark comparison • Revised 19 October 2026</w:t>
       </w:r>
     </w:p>
     <w:p>
@@ -31,7 +31,7 @@
         <w:rPr>
           <w:b w:val="0"/>
         </w:rPr>
-        <w:t>The available matched full comparison favors Single Agent on answer accuracy, task latency and estimated cost. V3 uses fewer measured tokens and tool calls. The measurements therefore support a specific efficiency tradeoff, rather than an overall performance advantage for the current V3 design.</w:t>
+        <w:t>We ran both systems against the full benchmark and report comparative results for 2,929 completed task pairs from 94 patients. Single Agent has higher answer accuracy, lower task latency and lower estimated cost. V3 uses fewer measured tokens and tool calls. These results describe the tradeoff in the current V3 design.</w:t>
       </w:r>
     </w:p>
     <w:tbl>
@@ -81,7 +81,7 @@
                 <w:color w:val="FFFFFF"/>
                 <w:sz w:val="19"/>
               </w:rPr>
-              <w:t>Run record</w:t>
+              <w:t>Analysis record</w:t>
             </w:r>
           </w:p>
         </w:tc>
@@ -492,7 +492,7 @@
                 <w:color w:val="000000"/>
                 <w:sz w:val="19"/>
               </w:rPr>
-              <w:t>Full V3 overall</w:t>
+              <w:t>Full comparison Single Agent</w:t>
             </w:r>
           </w:p>
         </w:tc>
@@ -525,7 +525,7 @@
                 <w:color w:val="000000"/>
                 <w:sz w:val="19"/>
               </w:rPr>
-              <w:t>2,931</w:t>
+              <w:t>2,929</w:t>
             </w:r>
           </w:p>
         </w:tc>
@@ -558,7 +558,7 @@
                 <w:color w:val="000000"/>
                 <w:sz w:val="19"/>
               </w:rPr>
-              <w:t>2,256</w:t>
+              <w:t>2,343</w:t>
             </w:r>
           </w:p>
         </w:tc>
@@ -591,7 +591,7 @@
                 <w:color w:val="000000"/>
                 <w:sz w:val="19"/>
               </w:rPr>
-              <w:t>76.97%</w:t>
+              <w:t>79.99%</w:t>
             </w:r>
           </w:p>
         </w:tc>
@@ -629,7 +629,7 @@
                 <w:color w:val="000000"/>
                 <w:sz w:val="19"/>
               </w:rPr>
-              <w:t>Full Single Agent available</w:t>
+              <w:t>Full comparison V3</w:t>
             </w:r>
           </w:p>
         </w:tc>
@@ -695,7 +695,7 @@
                 <w:color w:val="000000"/>
                 <w:sz w:val="19"/>
               </w:rPr>
-              <w:t>2,343</w:t>
+              <w:t>2,255</w:t>
             </w:r>
           </w:p>
         </w:tc>
@@ -728,7 +728,7 @@
                 <w:color w:val="000000"/>
                 <w:sz w:val="19"/>
               </w:rPr>
-              <w:t>79.99%</w:t>
+              <w:t>76.99%</w:t>
             </w:r>
           </w:p>
         </w:tc>
@@ -776,7 +776,7 @@
         <w:rPr>
           <w:b w:val="0"/>
         </w:rPr>
-        <w:t>The complete V3 result and the matched comparison answer different questions and retain separate denominators. The baseline has 2,929 available answers out of 2,931 planned; the main comparison is a posthoc matched available-cohort analysis. Development uses the historical 300-question first-attempt protocol and overlaps the full benchmark. These are four arm records, not four independent repetitions.</w:t>
+        <w:t>All full benchmark accuracy, time, token and cost figures in this document use the same 2,929 completed question IDs for both systems. Development uses the historical 300-question first-attempt protocol and overlaps the full benchmark. The four analysis rows describe two systems at two stages; they are not independent repetitions. Original execution counts remain in the archive registry.</w:t>
       </w:r>
     </w:p>
     <w:p>
@@ -861,7 +861,7 @@
         <w:rPr>
           <w:b w:val="0"/>
         </w:rPr>
-        <w:t>The primary comparison joins question IDs and verifies patient IDs, giving 2,929 matched pairs and 94 patients. Patient-cluster percentile intervals resample patients 10,000 times with seed 5106, retain their questions and estimate the question-weighted mean. Pairing is preserved in differences. Intervals describe this cohort and recorded run, not repeated deployments or random model seeds.</w:t>
+        <w:t>The primary comparison joins completed question IDs and verifies patient IDs, giving 2,929 matched pairs and 94 patients. Pairing was determined by outcome availability, without selecting by correctness; this is a posthoc descriptive comparison. Patient-cluster percentile intervals resample patients 10,000 times with seed 5106, retain their questions and estimate the question-weighted mean. Pairing is preserved in differences. Intervals describe these questions and the recorded run, not repeated deployments or random model seeds.</w:t>
       </w:r>
     </w:p>
     <w:p>
@@ -6864,7 +6864,7 @@
         <w:rPr>
           <w:b w:val="0"/>
         </w:rPr>
-        <w:t>Cache availability flags require care. The complete V3 cache reconciliation covers all 2,931 accepted questions. The preserved baseline provenance checkpoint covers 891 questions; a full baseline cache-metadata audit was not performed. Normalized numeric cache values are sufficient for reproducing these estimates, but are not a guarantee that every original metadata field was present. Dates, scheduling and prompt-prefix reuse were not randomized between arms.</w:t>
+        <w:t>Cache availability flags require care. The V3 cache reconciliation covers every V3 question used in this comparison. The preserved baseline provenance checkpoint covers 891 questions; a full baseline cache-metadata audit was not performed. Normalized numeric cache values are sufficient for reproducing these estimates, but are not a guarantee that every original metadata field was present. Dates, scheduling and prompt-prefix reuse were not randomized between arms.</w:t>
       </w:r>
     </w:p>
     <w:p>
@@ -8149,7 +8149,7 @@
         <w:rPr>
           <w:b w:val="0"/>
         </w:rPr>
-        <w:t>For this frozen V3 architecture and these recorded runs on the released benchmark, V3 reduces measured token and tool usage. On the available matched full cohort it has lower typed accuracy, greater per-task latency and greater cost under the recorded cache mix than the contemporaneous Single Agent control. The accuracy interval is conditional on patient sampling from this benchmark; it does not account for design selection on reused data.</w:t>
+        <w:t>For this frozen V3 architecture and these recorded runs on the released benchmark, V3 reduces measured token and tool usage. Across the 2,929 completed task pairs it has lower typed accuracy, greater per-task latency and greater cost under the recorded cache mix than the contemporaneous Single Agent control. The accuracy interval is conditional on patient sampling from this benchmark; it does not account for design selection on reused data.</w:t>
       </w:r>
     </w:p>
     <w:p>
@@ -8210,7 +8210,7 @@
         <w:pStyle w:val="Heading1"/>
       </w:pPr>
       <w:r>
-        <w:t>Complete V3 overall record</w:t>
+        <w:t>V3 comparison reference</w:t>
       </w:r>
     </w:p>
     <w:p>
@@ -8218,7 +8218,7 @@
         <w:rPr>
           <w:b w:val="0"/>
         </w:rPr>
-        <w:t>The complete V3 evaluation contains all 2,931 released questions from 94 patients: 2,256 correct, 675 wrong, 76.9703% accuracy, with a patient-cluster 95% interval [74.5292%, 79.3363%]. It remains an independently preserved arm result. The matched V3 subset has 2,255 correct among 2,929 and must be used for comparison to the available baseline.</w:t>
+        <w:t>V3 is evaluated on the same 2,929 completed question IDs as Single Agent, from 94 patients: 2,255 correct and 674 wrong, or 76.9887% accuracy. Its patient-cluster 95% interval is [74.5398, 79.3676]%. All values below use these 2,929 questions and agree with the paired analysis.</w:t>
       </w:r>
     </w:p>
     <w:tbl>
@@ -8266,7 +8266,7 @@
                 <w:color w:val="FFFFFF"/>
                 <w:sz w:val="19"/>
               </w:rPr>
-              <w:t>Complete V3 metric</w:t>
+              <w:t>V3 metric for 2929 questions</w:t>
             </w:r>
           </w:p>
         </w:tc>
@@ -8370,7 +8370,7 @@
                 <w:color w:val="000000"/>
                 <w:sz w:val="19"/>
               </w:rPr>
-              <w:t>2,256 / 2,931 = 76.9703%</w:t>
+              <w:t>2,255 / 2,929 = 76.9887%</w:t>
             </w:r>
           </w:p>
         </w:tc>
@@ -8441,7 +8441,7 @@
                 <w:color w:val="000000"/>
                 <w:sz w:val="19"/>
               </w:rPr>
-              <w:t>70,504.268 s</w:t>
+              <w:t>70,478.026 s</w:t>
             </w:r>
           </w:p>
         </w:tc>
@@ -8512,7 +8512,7 @@
                 <w:color w:val="000000"/>
                 <w:sz w:val="19"/>
               </w:rPr>
-              <w:t>24.0547 s / 20.4860 s</w:t>
+              <w:t>24.0621 s / 20.5120 s</w:t>
             </w:r>
           </w:p>
         </w:tc>
@@ -8583,7 +8583,7 @@
                 <w:color w:val="000000"/>
                 <w:sz w:val="19"/>
               </w:rPr>
-              <w:t>50.9185 s / 13.9804 s</w:t>
+              <w:t>50.9262 s / 13.9816 s</w:t>
             </w:r>
           </w:p>
         </w:tc>
@@ -8654,7 +8654,7 @@
                 <w:color w:val="000000"/>
                 <w:sz w:val="19"/>
               </w:rPr>
-              <w:t>[23.1050, 24.9964] s</w:t>
+              <w:t>[23.1126, 25.0024] s</w:t>
             </w:r>
           </w:p>
         </w:tc>
@@ -8725,7 +8725,7 @@
                 <w:color w:val="000000"/>
                 <w:sz w:val="19"/>
               </w:rPr>
-              <w:t>$14.81082369</w:t>
+              <w:t>$14.80618386</w:t>
             </w:r>
           </w:p>
         </w:tc>
@@ -8796,7 +8796,7 @@
                 <w:color w:val="000000"/>
                 <w:sz w:val="19"/>
               </w:rPr>
-              <w:t>$0.00505316 / $0.00405541</w:t>
+              <w:t>$0.00505503 / $0.00405661</w:t>
             </w:r>
           </w:p>
         </w:tc>
@@ -8867,7 +8867,7 @@
                 <w:color w:val="000000"/>
                 <w:sz w:val="19"/>
               </w:rPr>
-              <w:t>$0.013585405</w:t>
+              <w:t>$0.013585964</w:t>
             </w:r>
           </w:p>
         </w:tc>
@@ -8938,7 +8938,7 @@
                 <w:color w:val="000000"/>
                 <w:sz w:val="19"/>
               </w:rPr>
-              <w:t>[$0.00479423, $0.00532022]</w:t>
+              <w:t>[0.00479547, 0.00532168] USD</w:t>
             </w:r>
           </w:p>
         </w:tc>
@@ -9009,7 +9009,7 @@
                 <w:color w:val="000000"/>
                 <w:sz w:val="19"/>
               </w:rPr>
-              <w:t>156,787,021</w:t>
+              <w:t>156,736,271</w:t>
             </w:r>
           </w:p>
         </w:tc>
@@ -9080,7 +9080,7 @@
                 <w:color w:val="000000"/>
                 <w:sz w:val="19"/>
               </w:rPr>
-              <w:t>53,492.67 / 42,733</w:t>
+              <w:t>53,511.87 / 42,735</w:t>
             </w:r>
           </w:p>
         </w:tc>
@@ -9151,7 +9151,7 @@
                 <w:color w:val="000000"/>
                 <w:sz w:val="19"/>
               </w:rPr>
-              <w:t>143,016.5</w:t>
+              <w:t>143,060.6</w:t>
             </w:r>
           </w:p>
         </w:tc>
@@ -9222,7 +9222,7 @@
                 <w:color w:val="000000"/>
                 <w:sz w:val="19"/>
               </w:rPr>
-              <w:t>[50,852.12, 56,206.91]</w:t>
+              <w:t>[50,870.22, 56,226.78]</w:t>
             </w:r>
           </w:p>
         </w:tc>
@@ -9309,7 +9309,7 @@
         <w:rPr>
           <w:b w:val="0"/>
         </w:rPr>
-        <w:t>The original complete V3 delivery is preserved at benchmarks/v3-full-run-20261015/completed_v3/. Its historical statement that baseline work was deferred reflects its original finalization date. This consolidation adds the later available baseline comparison without rewriting that historical report or claiming the original full three-arm completion gate passed.</w:t>
+        <w:t>The source summaries are full_single_agent/matched_v3_summary.json and single_agent_summary.json. The root comparison_summary.csv provides both systems on the same denominator for later report tables and figures. Preserve these question IDs when joining further diagnostics.</w:t>
       </w:r>
     </w:p>
     <w:p>
@@ -9325,7 +9325,7 @@
         <w:rPr>
           <w:b w:val="0"/>
         </w:rPr>
-        <w:t>In the complete V3 record, 654 outputs have the syntactic empty/no-value flag. Of these, 422 are correct against empty reference results and 232 are incorrect. Among the other 2,277 outputs, 1,834 are correct and 443 incorrect. Thus the full 2,931-question score includes legitimate empty answers. This distinction is preserved in the numeric records.</w:t>
+        <w:t>Among the 2,929 V3 comparison outputs, 653 have the syntactic empty/no-value flag. Of these, 422 are correct against empty reference results and 231 are incorrect. Among the other 2,276 outputs, 1,833 are correct and 443 incorrect. The 76.9887% score includes legitimate empty answers. This distinction is preserved in the numeric records.</w:t>
       </w:r>
     </w:p>
     <w:p>
@@ -9333,7 +9333,7 @@
         <w:rPr>
           <w:b w:val="0"/>
         </w:rPr>
-        <w:t>The recorded V3 operational interval from first batch start to last seal is 40,426 seconds, or 11 hours 13 minutes 46 seconds, with two workers. This contextual wall interval is distinct from accepted task-time totals and should not be used as an architecture-only speed metric.</w:t>
+        <w:t>Use the 70,478.026-second selected task-time sum for this V3 comparison. Historical experiment wall intervals remain in the execution archive; concurrency and scheduling make them different measurements from accumulated task time.</w:t>
       </w:r>
     </w:p>
     <w:p>
@@ -9544,6 +9544,77 @@
                 <w:color w:val="000000"/>
                 <w:sz w:val="19"/>
               </w:rPr>
+              <w:t>comparison_summary.csv</w:t>
+            </w:r>
+          </w:p>
+        </w:tc>
+        <w:tc>
+          <w:tcPr>
+            <w:tcW w:type="dxa" w:w="6192"/>
+            <w:vAlign w:val="center"/>
+            <w:shd w:fill="FFFFFF"/>
+            <w:tcBorders>
+              <w:top w:val="single" w:sz="4" w:color="D9D9D9"/>
+              <w:left w:val="single" w:sz="4" w:color="D9D9D9"/>
+              <w:bottom w:val="single" w:sz="4" w:color="D9D9D9"/>
+              <w:right w:val="single" w:sz="4" w:color="D9D9D9"/>
+            </w:tcBorders>
+            <w:tcMar>
+              <w:top w:w="75" w:type="dxa"/>
+              <w:bottom w:w="75" w:type="dxa"/>
+              <w:left w:w="85" w:type="dxa"/>
+              <w:right w:w="85" w:type="dxa"/>
+            </w:tcMar>
+          </w:tcPr>
+          <w:p>
+            <w:pPr>
+              <w:spacing w:after="20" w:line="245" w:lineRule="auto"/>
+              <w:jc w:val="left"/>
+            </w:pPr>
+            <w:r>
+              <w:rPr>
+                <w:b w:val="0"/>
+                <w:color w:val="000000"/>
+                <w:sz w:val="19"/>
+              </w:rPr>
+              <w:t>Primary V3 and Single Agent figures on 2,929 questions each</w:t>
+            </w:r>
+          </w:p>
+        </w:tc>
+      </w:tr>
+      <w:tr>
+        <w:trPr>
+          <w:cantSplit/>
+        </w:trPr>
+        <w:tc>
+          <w:tcPr>
+            <w:tcW w:type="dxa" w:w="4032"/>
+            <w:vAlign w:val="center"/>
+            <w:shd w:fill="F1F5F9"/>
+            <w:tcBorders>
+              <w:top w:val="single" w:sz="4" w:color="D9D9D9"/>
+              <w:left w:val="single" w:sz="4" w:color="D9D9D9"/>
+              <w:bottom w:val="single" w:sz="4" w:color="D9D9D9"/>
+              <w:right w:val="single" w:sz="4" w:color="D9D9D9"/>
+            </w:tcBorders>
+            <w:tcMar>
+              <w:top w:w="75" w:type="dxa"/>
+              <w:bottom w:w="75" w:type="dxa"/>
+              <w:left w:w="85" w:type="dxa"/>
+              <w:right w:w="85" w:type="dxa"/>
+            </w:tcMar>
+          </w:tcPr>
+          <w:p>
+            <w:pPr>
+              <w:spacing w:after="20" w:line="245" w:lineRule="auto"/>
+              <w:jc w:val="left"/>
+            </w:pPr>
+            <w:r>
+              <w:rPr>
+                <w:b w:val="0"/>
+                <w:color w:val="000000"/>
+                <w:sz w:val="19"/>
+              </w:rPr>
               <w:t>development/</w:t>
             </w:r>
           </w:p>
@@ -9552,7 +9623,7 @@
           <w:tcPr>
             <w:tcW w:type="dxa" w:w="6192"/>
             <w:vAlign w:val="center"/>
-            <w:shd w:fill="FFFFFF"/>
+            <w:shd w:fill="F1F5F9"/>
             <w:tcBorders>
               <w:top w:val="single" w:sz="4" w:color="D9D9D9"/>
               <w:left w:val="single" w:sz="4" w:color="D9D9D9"/>
@@ -9590,7 +9661,7 @@
           <w:tcPr>
             <w:tcW w:type="dxa" w:w="4032"/>
             <w:vAlign w:val="center"/>
-            <w:shd w:fill="F1F5F9"/>
+            <w:shd w:fill="FFFFFF"/>
             <w:tcBorders>
               <w:top w:val="single" w:sz="4" w:color="D9D9D9"/>
               <w:left w:val="single" w:sz="4" w:color="D9D9D9"/>
@@ -9623,7 +9694,7 @@
           <w:tcPr>
             <w:tcW w:type="dxa" w:w="6192"/>
             <w:vAlign w:val="center"/>
-            <w:shd w:fill="F1F5F9"/>
+            <w:shd w:fill="FFFFFF"/>
             <w:tcBorders>
               <w:top w:val="single" w:sz="4" w:color="D9D9D9"/>
               <w:left w:val="single" w:sz="4" w:color="D9D9D9"/>
@@ -9661,7 +9732,7 @@
           <w:tcPr>
             <w:tcW w:type="dxa" w:w="4032"/>
             <w:vAlign w:val="center"/>
-            <w:shd w:fill="FFFFFF"/>
+            <w:shd w:fill="F1F5F9"/>
             <w:tcBorders>
               <w:top w:val="single" w:sz="4" w:color="D9D9D9"/>
               <w:left w:val="single" w:sz="4" w:color="D9D9D9"/>
@@ -9694,6 +9765,44 @@
           <w:tcPr>
             <w:tcW w:type="dxa" w:w="6192"/>
             <w:vAlign w:val="center"/>
+            <w:shd w:fill="F1F5F9"/>
+            <w:tcBorders>
+              <w:top w:val="single" w:sz="4" w:color="D9D9D9"/>
+              <w:left w:val="single" w:sz="4" w:color="D9D9D9"/>
+              <w:bottom w:val="single" w:sz="4" w:color="D9D9D9"/>
+              <w:right w:val="single" w:sz="4" w:color="D9D9D9"/>
+            </w:tcBorders>
+            <w:tcMar>
+              <w:top w:w="75" w:type="dxa"/>
+              <w:bottom w:w="75" w:type="dxa"/>
+              <w:left w:w="85" w:type="dxa"/>
+              <w:right w:w="85" w:type="dxa"/>
+            </w:tcMar>
+          </w:tcPr>
+          <w:p>
+            <w:pPr>
+              <w:spacing w:after="20" w:line="245" w:lineRule="auto"/>
+              <w:jc w:val="left"/>
+            </w:pPr>
+            <w:r>
+              <w:rPr>
+                <w:b w:val="0"/>
+                <w:color w:val="000000"/>
+                <w:sz w:val="19"/>
+              </w:rPr>
+              <w:t>Original execution archive with all 2,931 V3 records and owned audit payloads</w:t>
+            </w:r>
+          </w:p>
+        </w:tc>
+      </w:tr>
+      <w:tr>
+        <w:trPr>
+          <w:cantSplit/>
+        </w:trPr>
+        <w:tc>
+          <w:tcPr>
+            <w:tcW w:type="dxa" w:w="4032"/>
+            <w:vAlign w:val="center"/>
             <w:shd w:fill="FFFFFF"/>
             <w:tcBorders>
               <w:top w:val="single" w:sz="4" w:color="D9D9D9"/>
@@ -9719,7 +9828,40 @@
                 <w:color w:val="000000"/>
                 <w:sz w:val="19"/>
               </w:rPr>
-              <w:t>All 2,931 canonical V3 records and owned audit payloads</w:t>
+              <w:t>cost_cache_sensitivity.json</w:t>
+            </w:r>
+          </w:p>
+        </w:tc>
+        <w:tc>
+          <w:tcPr>
+            <w:tcW w:type="dxa" w:w="6192"/>
+            <w:vAlign w:val="center"/>
+            <w:shd w:fill="FFFFFF"/>
+            <w:tcBorders>
+              <w:top w:val="single" w:sz="4" w:color="D9D9D9"/>
+              <w:left w:val="single" w:sz="4" w:color="D9D9D9"/>
+              <w:bottom w:val="single" w:sz="4" w:color="D9D9D9"/>
+              <w:right w:val="single" w:sz="4" w:color="D9D9D9"/>
+            </w:tcBorders>
+            <w:tcMar>
+              <w:top w:w="75" w:type="dxa"/>
+              <w:bottom w:w="75" w:type="dxa"/>
+              <w:left w:w="85" w:type="dxa"/>
+              <w:right w:w="85" w:type="dxa"/>
+            </w:tcMar>
+          </w:tcPr>
+          <w:p>
+            <w:pPr>
+              <w:spacing w:after="20" w:line="245" w:lineRule="auto"/>
+              <w:jc w:val="left"/>
+            </w:pPr>
+            <w:r>
+              <w:rPr>
+                <w:b w:val="0"/>
+                <w:color w:val="000000"/>
+                <w:sz w:val="19"/>
+              </w:rPr>
+              <w:t>Frozen-rate, fixed-usage cache scenario</w:t>
             </w:r>
           </w:p>
         </w:tc>
@@ -9757,7 +9899,7 @@
                 <w:color w:val="000000"/>
                 <w:sz w:val="19"/>
               </w:rPr>
-              <w:t>cost_cache_sensitivity.json</w:t>
+              <w:t>PACKAGE_MANIFEST.json</w:t>
             </w:r>
           </w:p>
         </w:tc>
@@ -9790,7 +9932,7 @@
                 <w:color w:val="000000"/>
                 <w:sz w:val="19"/>
               </w:rPr>
-              <w:t>Frozen-rate, fixed-usage cache scenario</w:t>
+              <w:t>Artifact sizes and SHA256 inventory</w:t>
             </w:r>
           </w:p>
         </w:tc>
@@ -9828,7 +9970,7 @@
                 <w:color w:val="000000"/>
                 <w:sz w:val="19"/>
               </w:rPr>
-              <w:t>PACKAGE_MANIFEST.json</w:t>
+              <w:t>reproduce/</w:t>
             </w:r>
           </w:p>
         </w:tc>
@@ -9837,77 +9979,6 @@
             <w:tcW w:type="dxa" w:w="6192"/>
             <w:vAlign w:val="center"/>
             <w:shd w:fill="FFFFFF"/>
-            <w:tcBorders>
-              <w:top w:val="single" w:sz="4" w:color="D9D9D9"/>
-              <w:left w:val="single" w:sz="4" w:color="D9D9D9"/>
-              <w:bottom w:val="single" w:sz="4" w:color="D9D9D9"/>
-              <w:right w:val="single" w:sz="4" w:color="D9D9D9"/>
-            </w:tcBorders>
-            <w:tcMar>
-              <w:top w:w="75" w:type="dxa"/>
-              <w:bottom w:w="75" w:type="dxa"/>
-              <w:left w:w="85" w:type="dxa"/>
-              <w:right w:w="85" w:type="dxa"/>
-            </w:tcMar>
-          </w:tcPr>
-          <w:p>
-            <w:pPr>
-              <w:spacing w:after="20" w:line="245" w:lineRule="auto"/>
-              <w:jc w:val="left"/>
-            </w:pPr>
-            <w:r>
-              <w:rPr>
-                <w:b w:val="0"/>
-                <w:color w:val="000000"/>
-                <w:sz w:val="19"/>
-              </w:rPr>
-              <w:t>Artifact sizes and SHA256 inventory</w:t>
-            </w:r>
-          </w:p>
-        </w:tc>
-      </w:tr>
-      <w:tr>
-        <w:trPr>
-          <w:cantSplit/>
-        </w:trPr>
-        <w:tc>
-          <w:tcPr>
-            <w:tcW w:type="dxa" w:w="4032"/>
-            <w:vAlign w:val="center"/>
-            <w:shd w:fill="F1F5F9"/>
-            <w:tcBorders>
-              <w:top w:val="single" w:sz="4" w:color="D9D9D9"/>
-              <w:left w:val="single" w:sz="4" w:color="D9D9D9"/>
-              <w:bottom w:val="single" w:sz="4" w:color="D9D9D9"/>
-              <w:right w:val="single" w:sz="4" w:color="D9D9D9"/>
-            </w:tcBorders>
-            <w:tcMar>
-              <w:top w:w="75" w:type="dxa"/>
-              <w:bottom w:w="75" w:type="dxa"/>
-              <w:left w:w="85" w:type="dxa"/>
-              <w:right w:w="85" w:type="dxa"/>
-            </w:tcMar>
-          </w:tcPr>
-          <w:p>
-            <w:pPr>
-              <w:spacing w:after="20" w:line="245" w:lineRule="auto"/>
-              <w:jc w:val="left"/>
-            </w:pPr>
-            <w:r>
-              <w:rPr>
-                <w:b w:val="0"/>
-                <w:color w:val="000000"/>
-                <w:sz w:val="19"/>
-              </w:rPr>
-              <w:t>reproduce/</w:t>
-            </w:r>
-          </w:p>
-        </w:tc>
-        <w:tc>
-          <w:tcPr>
-            <w:tcW w:type="dxa" w:w="6192"/>
-            <w:vAlign w:val="center"/>
-            <w:shd w:fill="F1F5F9"/>
             <w:tcBorders>
               <w:top w:val="single" w:sz="4" w:color="D9D9D9"/>
               <w:left w:val="single" w:sz="4" w:color="D9D9D9"/>
@@ -9965,6 +10036,14 @@
           <w:b w:val="0"/>
         </w:rPr>
         <w:t>llm_calls and executed-tool counts measure different operations. evidence_count counts recorded evidence entries, while evidence_valid, precision and recall require recorded validation and can be missing. Draft/final transitions apply only where a draft exists. Empty/no-value, limitation and budget-stop flags retain their recorded meanings; none substitutes for typed correctness.</w:t>
+      </w:r>
+    </w:p>
+    <w:p>
+      <w:r>
+        <w:rPr>
+          <w:b w:val="0"/>
+        </w:rPr>
+        <w:t>The released benchmark and original V3 execution archive contain 2,931 questions. The report compares the 2,929 question IDs with completed outcomes from both systems. RUN_REGISTRY.json and run_summary.csv retain original execution counts; comparison_summary.csv contains the primary reporting figures. This reporting view preserves the raw records and does not change the benchmark definition.</w:t>
       </w:r>
     </w:p>
     <w:p>
@@ -10093,7 +10172,7 @@
         <w:rPr>
           <w:b w:val="0"/>
         </w:rPr>
-        <w:t>4. Use matched 2,929-question files for comparisons, the complete V3 package for the 2,931-question arm result and development files for the reused checkpoint. Full comparison paired JSON files use Single Agent minus V3; development paired tables and this handoff use V3 minus Single Agent.</w:t>
+        <w:t>4. Use comparison_summary.csv and the matched 2,929-question files for full benchmark figures. Use development files for the reused checkpoint. The original V3 execution package supplies archival provenance. Full comparison paired JSON files use Single Agent minus V3; development paired tables and this handoff use V3 minus Single Agent.</w:t>
       </w:r>
     </w:p>
     <w:p>
@@ -10142,10 +10221,10 @@
     </w:pPr>
     <w:r>
       <w:rPr>
-        <w:color w:val="555555"/>
+        <w:color w:val="000000"/>
         <w:sz w:val="16"/>
       </w:rPr>
-      <w:t>V3 MIDTERM RESULTS   |   Consolidated analysis   |   17 October 2026</w:t>
+      <w:t>V3 MIDTERM RESULTS   |   2,929 completed pairs   |   Revised 19 October 2026</w:t>
     </w:r>
   </w:p>
 </w:hdr>

</xml_diff>